<commit_message>
docs: agrega la URL del repositorio Git en los anexos
</commit_message>
<xml_diff>
--- a/docs/Trabajo_Parcial_FP2.docx
+++ b/docs/Trabajo_Parcial_FP2.docx
@@ -6829,13 +6829,16 @@
       <w:pPr>
         <w:jc w:val="both"/>
       </w:pPr>
-      <w:r>
-        <w:rPr>
-          <w:b w:val="0"/>
-          <w:i w:val="0"/>
-        </w:rPr>
-        <w:t>[INSERTAR URL DE GIT]</w:t>
-      </w:r>
+      <w:hyperlink r:id="rId26">
+        <w:r>
+          <w:rPr>
+            <w:rFonts w:ascii="Calibri" w:hAnsi="Calibri"/>
+            <w:color w:val="0563C1"/>
+            <w:u w:val="single"/>
+          </w:rPr>
+          <w:t xml:space="preserve">https://github.com/marlo4220mc/sistema-horas-extras</w:t>
+        </w:r>
+      </w:hyperlink>
     </w:p>
     <w:p>
       <w:pPr>
@@ -6846,7 +6849,7 @@
           <w:b w:val="0"/>
           <w:i w:val="0"/>
         </w:rPr>
-        <w:t xml:space="preserve">URL del repositorio con los </w:t>
+        <w:t xml:space="preserve">Repositorio privado con los </w:t>
       </w:r>
       <w:r>
         <w:rPr>
@@ -6860,7 +6863,7 @@
           <w:b w:val="0"/>
           <w:i w:val="0"/>
         </w:rPr>
-        <w:t xml:space="preserve"> por rol de todo el equipo.</w:t>
+        <w:t xml:space="preserve"> del equipo (historia por etapas).</w:t>
       </w:r>
     </w:p>
     <w:p>

</xml_diff>

<commit_message>
docs: agrega la URL y la captura del tablero de Trello en los anexos
</commit_message>
<xml_diff>
--- a/docs/Trabajo_Parcial_FP2.docx
+++ b/docs/Trabajo_Parcial_FP2.docx
@@ -6883,7 +6883,7 @@
           <w:b w:val="0"/>
           <w:i w:val="0"/>
         </w:rPr>
-        <w:t>[INSERTAR URL DE TRELLO]</w:t>
+        <w:t>https://trello.com/b/VRlZeBkn/sistema-de-horas-extras-tp-fp2</w:t>
       </w:r>
     </w:p>
     <w:p>
@@ -6896,6 +6896,58 @@
           <w:i w:val="0"/>
         </w:rPr>
         <w:t>Tablero de gestión del cronograma y de las actividades del equipo.</w:t>
+      </w:r>
+    </w:p>
+    <w:p>
+      <w:pPr>
+        <w:jc w:val="center"/>
+      </w:pPr>
+      <w:r>
+        <w:drawing>
+          <wp:inline xmlns:a="http://schemas.openxmlformats.org/drawingml/2006/main" xmlns:pic="http://schemas.openxmlformats.org/drawingml/2006/picture">
+            <wp:extent cx="5486400" cy="3718056"/>
+            <wp:docPr id="8" name="Picture 8"/>
+            <wp:cNvGraphicFramePr>
+              <a:graphicFrameLocks noChangeAspect="1"/>
+            </wp:cNvGraphicFramePr>
+            <a:graphic>
+              <a:graphicData uri="http://schemas.openxmlformats.org/drawingml/2006/picture">
+                <pic:pic>
+                  <pic:nvPicPr>
+                    <pic:cNvPr id="0" name="tablero_trello.png"/>
+                    <pic:cNvPicPr/>
+                  </pic:nvPicPr>
+                  <pic:blipFill>
+                    <a:blip r:embed="rId27"/>
+                    <a:stretch>
+                      <a:fillRect/>
+                    </a:stretch>
+                  </pic:blipFill>
+                  <pic:spPr>
+                    <a:xfrm>
+                      <a:off x="0" y="0"/>
+                      <a:ext cx="5486400" cy="3718056"/>
+                    </a:xfrm>
+                    <a:prstGeom prst="rect"/>
+                  </pic:spPr>
+                </pic:pic>
+              </a:graphicData>
+            </a:graphic>
+          </wp:inline>
+        </w:drawing>
+      </w:r>
+    </w:p>
+    <w:p>
+      <w:pPr>
+        <w:jc w:val="center"/>
+      </w:pPr>
+      <w:r>
+        <w:rPr>
+          <w:i/>
+          <w:color w:val="595959"/>
+          <w:sz w:val="18"/>
+        </w:rPr>
+        <w:t>Figura 7. Tablero de Trello con el cronograma y la asignación de actividades</w:t>
       </w:r>
     </w:p>
     <w:sectPr>

</xml_diff>

<commit_message>
feat(aprobacion): solo un supervisor puede aprobar o rechazar solicitudes
</commit_message>
<xml_diff>
--- a/docs/Trabajo_Parcial_FP2.docx
+++ b/docs/Trabajo_Parcial_FP2.docx
@@ -6064,15 +6064,13 @@
       <w:r>
         <w:rPr>
           <w:b w:val="0"/>
-          <w:i w:val="0"/>
         </w:rPr>
-        <w:t xml:space="preserve">Seis excepciones propias controlan los errores de negocio: </w:t>
+        <w:t xml:space="preserve">Siete excepciones propias controlan los errores de negocio: </w:t>
       </w:r>
       <w:r>
         <w:rPr>
           <w:rFonts w:ascii="Consolas" w:hAnsi="Consolas"/>
           <w:b w:val="0"/>
-          <w:i w:val="0"/>
           <w:sz w:val="19"/>
         </w:rPr>
         <w:t>EmpleadoNoEncontradoError</w:t>
@@ -6080,7 +6078,6 @@
       <w:r>
         <w:rPr>
           <w:b w:val="0"/>
-          <w:i w:val="0"/>
         </w:rPr>
         <w:t xml:space="preserve">, </w:t>
       </w:r>
@@ -6088,7 +6085,6 @@
         <w:rPr>
           <w:rFonts w:ascii="Consolas" w:hAnsi="Consolas"/>
           <w:b w:val="0"/>
-          <w:i w:val="0"/>
           <w:sz w:val="19"/>
         </w:rPr>
         <w:t>EmpleadoDuplicadoError</w:t>
@@ -6096,7 +6092,6 @@
       <w:r>
         <w:rPr>
           <w:b w:val="0"/>
-          <w:i w:val="0"/>
         </w:rPr>
         <w:t xml:space="preserve">, </w:t>
       </w:r>
@@ -6104,7 +6099,6 @@
         <w:rPr>
           <w:rFonts w:ascii="Consolas" w:hAnsi="Consolas"/>
           <w:b w:val="0"/>
-          <w:i w:val="0"/>
           <w:sz w:val="19"/>
         </w:rPr>
         <w:t>HorasInvalidasError</w:t>
@@ -6112,7 +6106,6 @@
       <w:r>
         <w:rPr>
           <w:b w:val="0"/>
-          <w:i w:val="0"/>
         </w:rPr>
         <w:t xml:space="preserve">, </w:t>
       </w:r>
@@ -6120,7 +6113,6 @@
         <w:rPr>
           <w:rFonts w:ascii="Consolas" w:hAnsi="Consolas"/>
           <w:b w:val="0"/>
-          <w:i w:val="0"/>
           <w:sz w:val="19"/>
         </w:rPr>
         <w:t>SaldoInsuficienteError</w:t>
@@ -6128,7 +6120,6 @@
       <w:r>
         <w:rPr>
           <w:b w:val="0"/>
-          <w:i w:val="0"/>
         </w:rPr>
         <w:t xml:space="preserve">, </w:t>
       </w:r>
@@ -6136,7 +6127,6 @@
         <w:rPr>
           <w:rFonts w:ascii="Consolas" w:hAnsi="Consolas"/>
           <w:b w:val="0"/>
-          <w:i w:val="0"/>
           <w:sz w:val="19"/>
         </w:rPr>
         <w:t>SolicitudNoEncontradaError</w:t>
@@ -6144,7 +6134,20 @@
       <w:r>
         <w:rPr>
           <w:b w:val="0"/>
-          <w:i w:val="0"/>
+        </w:rPr>
+        <w:t xml:space="preserve">, </w:t>
+      </w:r>
+      <w:r>
+        <w:rPr>
+          <w:rFonts w:ascii="Consolas" w:hAnsi="Consolas"/>
+          <w:b w:val="0"/>
+          <w:sz w:val="19"/>
+        </w:rPr>
+        <w:t>EstadoSolicitudInvalidaError</w:t>
+      </w:r>
+      <w:r>
+        <w:rPr>
+          <w:b w:val="0"/>
         </w:rPr>
         <w:t xml:space="preserve"> y </w:t>
       </w:r>
@@ -6152,23 +6155,32 @@
         <w:rPr>
           <w:rFonts w:ascii="Consolas" w:hAnsi="Consolas"/>
           <w:b w:val="0"/>
-          <w:i w:val="0"/>
           <w:sz w:val="19"/>
         </w:rPr>
-        <w:t>EstadoSolicitudInvalidaError</w:t>
+        <w:t>AprobacionNoAutorizadaError</w:t>
       </w:r>
       <w:r>
         <w:rPr>
           <w:b w:val="0"/>
-          <w:i w:val="0"/>
         </w:rPr>
-        <w:t xml:space="preserve">. Para los datos simples (texto vacío, salario negativo) se usa </w:t>
+        <w:t xml:space="preserve">. Esta última aplica la regla de que </w:t>
+      </w:r>
+      <w:r>
+        <w:rPr>
+          <w:b/>
+        </w:rPr>
+        <w:t>solo un supervisor registrado puede aprobar o rechazar</w:t>
+      </w:r>
+      <w:r>
+        <w:rPr>
+          <w:b w:val="0"/>
+        </w:rPr>
+        <w:t xml:space="preserve"> una solicitud: el gestor busca al empleado que intenta aprobar y, si no es supervisor, rechaza la operación. Para los datos simples (texto vacío, salario negativo) se usa </w:t>
       </w:r>
       <w:r>
         <w:rPr>
           <w:rFonts w:ascii="Consolas" w:hAnsi="Consolas"/>
           <w:b w:val="0"/>
-          <w:i w:val="0"/>
           <w:sz w:val="19"/>
         </w:rPr>
         <w:t>ValueError</w:t>
@@ -6176,7 +6188,6 @@
       <w:r>
         <w:rPr>
           <w:b w:val="0"/>
-          <w:i w:val="0"/>
         </w:rPr>
         <w:t>. El menú captura todas ellas y continúa funcionando.</w:t>
       </w:r>
@@ -6670,7 +6681,7 @@
           <w:b w:val="0"/>
           <w:i w:val="0"/>
         </w:rPr>
-        <w:t xml:space="preserve">: 21 pruebas ejecutadas, 21 correctas, 0 fallidas. Detalle en </w:t>
+        <w:t xml:space="preserve">: 23 pruebas ejecutadas, 23 correctas, 0 fallidas. Detalle en </w:t>
       </w:r>
       <w:r>
         <w:rPr>

</xml_diff>